<commit_message>
lawmaker-sprint-13-fixes: Address all of Jim's comments, fixing various bugs
</commit_message>
<xml_diff>
--- a/test/lawmaker/ukpubb/testImage.docx
+++ b/test/lawmaker/ukpubb/testImage.docx
@@ -1,6 +1,6 @@
 
 <file path=word/document.xml><?xml version="1.0" encoding="utf-8"?>
-<w:document xmlns:wpc="http://schemas.microsoft.com/office/word/2010/wordprocessingCanvas" xmlns:cx="http://schemas.microsoft.com/office/drawing/2014/chartex" xmlns:cx1="http://schemas.microsoft.com/office/drawing/2015/9/8/chartex" xmlns:cx2="http://schemas.microsoft.com/office/drawing/2015/10/21/chartex" xmlns:cx3="http://schemas.microsoft.com/office/drawing/2016/5/9/chartex" xmlns:cx4="http://schemas.microsoft.com/office/drawing/2016/5/10/chartex" xmlns:cx5="http://schemas.microsoft.com/office/drawing/2016/5/11/chartex" xmlns:cx6="http://schemas.microsoft.com/office/drawing/2016/5/12/chartex" xmlns:cx7="http://schemas.microsoft.com/office/drawing/2016/5/13/chartex" xmlns:cx8="http://schemas.microsoft.com/office/drawing/2016/5/14/chartex" xmlns:mc="http://schemas.openxmlformats.org/markup-compatibility/2006" xmlns:aink="http://schemas.microsoft.com/office/drawing/2016/ink" xmlns:am3d="http://schemas.microsoft.com/office/drawing/2017/model3d" xmlns:o="urn:schemas-microsoft-com:office:office" xmlns:oel="http://schemas.microsoft.com/office/2019/extlst" xmlns:r="http://schemas.openxmlformats.org/officeDocument/2006/relationships" xmlns:m="http://schemas.openxmlformats.org/officeDocument/2006/math" xmlns:v="urn:schemas-microsoft-com:vml" xmlns:wp14="http://schemas.microsoft.com/office/word/2010/wordprocessingDrawing" xmlns:wp="http://schemas.openxmlformats.org/drawingml/2006/wordprocessingDrawing" xmlns:w10="urn:schemas-microsoft-com:office:word" xmlns:w="http://schemas.openxmlformats.org/wordprocessingml/2006/main" xmlns:w14="http://schemas.microsoft.com/office/word/2010/wordml" xmlns:w15="http://schemas.microsoft.com/office/word/2012/wordml" xmlns:w16cex="http://schemas.microsoft.com/office/word/2018/wordml/cex" xmlns:w16cid="http://schemas.microsoft.com/office/word/2016/wordml/cid" xmlns:w16="http://schemas.microsoft.com/office/word/2018/wordml" xmlns:w16du="http://schemas.microsoft.com/office/word/2023/wordml/word16du" xmlns:w16sdtdh="http://schemas.microsoft.com/office/word/2020/wordml/sdtdatahash" xmlns:w16sdtfl="http://schemas.microsoft.com/office/word/2024/wordml/sdtformatlock" xmlns:w16se="http://schemas.microsoft.com/office/word/2015/wordml/symex" xmlns:wpg="http://schemas.microsoft.com/office/word/2010/wordprocessingGroup" xmlns:wpi="http://schemas.microsoft.com/office/word/2010/wordprocessingInk" xmlns:wne="http://schemas.microsoft.com/office/word/2006/wordml" xmlns:wps="http://schemas.microsoft.com/office/word/2010/wordprocessingShape" mc:Ignorable="w14 w15 w16se w16cid w16 w16cex w16sdtdh w16sdtfl w16du wp14">
+<w:document xmlns:wpc="http://schemas.microsoft.com/office/word/2010/wordprocessingCanvas" xmlns:cx="http://schemas.microsoft.com/office/drawing/2014/chartex" xmlns:cx1="http://schemas.microsoft.com/office/drawing/2015/9/8/chartex" xmlns:cx2="http://schemas.microsoft.com/office/drawing/2015/10/21/chartex" xmlns:cx3="http://schemas.microsoft.com/office/drawing/2016/5/9/chartex" xmlns:cx4="http://schemas.microsoft.com/office/drawing/2016/5/10/chartex" xmlns:cx5="http://schemas.microsoft.com/office/drawing/2016/5/11/chartex" xmlns:cx6="http://schemas.microsoft.com/office/drawing/2016/5/12/chartex" xmlns:cx7="http://schemas.microsoft.com/office/drawing/2016/5/13/chartex" xmlns:cx8="http://schemas.microsoft.com/office/drawing/2016/5/14/chartex" xmlns:mc="http://schemas.openxmlformats.org/markup-compatibility/2006" xmlns:aink="http://schemas.microsoft.com/office/drawing/2016/ink" xmlns:am3d="http://schemas.microsoft.com/office/drawing/2017/model3d" xmlns:o="urn:schemas-microsoft-com:office:office" xmlns:r="http://schemas.openxmlformats.org/officeDocument/2006/relationships" xmlns:m="http://schemas.openxmlformats.org/officeDocument/2006/math" xmlns:v="urn:schemas-microsoft-com:vml" xmlns:wp14="http://schemas.microsoft.com/office/word/2010/wordprocessingDrawing" xmlns:wp="http://schemas.openxmlformats.org/drawingml/2006/wordprocessingDrawing" xmlns:w10="urn:schemas-microsoft-com:office:word" xmlns:w="http://schemas.openxmlformats.org/wordprocessingml/2006/main" xmlns:w14="http://schemas.microsoft.com/office/word/2010/wordml" xmlns:w15="http://schemas.microsoft.com/office/word/2012/wordml" xmlns:w16cex="http://schemas.microsoft.com/office/word/2018/wordml/cex" xmlns:w16cid="http://schemas.microsoft.com/office/word/2016/wordml/cid" xmlns:w16="http://schemas.microsoft.com/office/word/2018/wordml" xmlns:w16sdtdh="http://schemas.microsoft.com/office/word/2020/wordml/sdtdatahash" xmlns:w16se="http://schemas.microsoft.com/office/word/2015/wordml/symex" xmlns:wpg="http://schemas.microsoft.com/office/word/2010/wordprocessingGroup" xmlns:wpi="http://schemas.microsoft.com/office/word/2010/wordprocessingInk" xmlns:wne="http://schemas.microsoft.com/office/word/2006/wordml" xmlns:wps="http://schemas.microsoft.com/office/word/2010/wordprocessingShape" mc:Ignorable="w14 w15 w16se w16cid w16 w16cex w16sdtdh wp14">
   <w:body>
     <w:p>
       <w:pPr>
@@ -35,15 +35,7 @@
         <w:ind w:left="730" w:right="679"/>
       </w:pPr>
       <w:r>
-        <w:t>This Act may be cited as the Cheltenham Borough Council (Markets) Act 202</w:t>
-      </w:r>
-      <w:proofErr w:type="gramStart"/>
-      <w:r>
-        <w:t>[ ]</w:t>
-      </w:r>
-      <w:proofErr w:type="gramEnd"/>
-      <w:r>
-        <w:t xml:space="preserve"> and comes into force at the end of 28 days beginning with the day on which this Act is passed. </w:t>
+        <w:t xml:space="preserve">This Act may be cited as the Cheltenham Borough Council (Markets) Act 202[ ] and comes into force at the end of 28 days beginning with the day on which this Act is passed. </w:t>
       </w:r>
     </w:p>
     <w:p>
@@ -142,15 +134,7 @@
         <w:ind w:left="1210" w:right="679"/>
       </w:pPr>
       <w:r>
-        <w:t>“</w:t>
-      </w:r>
-      <w:proofErr w:type="gramStart"/>
-      <w:r>
-        <w:t>authorised</w:t>
-      </w:r>
-      <w:proofErr w:type="gramEnd"/>
-      <w:r>
-        <w:t xml:space="preserve"> person” means— </w:t>
+        <w:t xml:space="preserve">“authorised person” means— </w:t>
       </w:r>
     </w:p>
     <w:p>
@@ -159,15 +143,7 @@
         <w:ind w:left="2160" w:right="679" w:hanging="497"/>
       </w:pPr>
       <w:r>
-        <w:t xml:space="preserve">(a) a person acting </w:t>
-      </w:r>
-      <w:proofErr w:type="gramStart"/>
-      <w:r>
-        <w:t>in the course of</w:t>
-      </w:r>
-      <w:proofErr w:type="gramEnd"/>
-      <w:r>
-        <w:t xml:space="preserve"> that person’s duties who is authorised by the Council to exercise one or more of the functions under sections 4 and 5 of this Act; or </w:t>
+        <w:t xml:space="preserve">(a) a person acting in the course of that person’s duties who is authorised by the Council to exercise one or more of the functions under sections 4 and 5 of this Act; or </w:t>
       </w:r>
     </w:p>
     <w:p>
@@ -175,15 +151,7 @@
         <w:ind w:left="2160" w:right="679" w:hanging="508"/>
       </w:pPr>
       <w:r>
-        <w:t xml:space="preserve">(b) a constable, a Police Community Support Officer, a person accredited under section 41 (accreditation under community safety accreditation schemes) of the Police Reform Act 2002, or a traffic officer, each acting </w:t>
-      </w:r>
-      <w:proofErr w:type="gramStart"/>
-      <w:r>
-        <w:t>in the course of</w:t>
-      </w:r>
-      <w:proofErr w:type="gramEnd"/>
-      <w:r>
-        <w:t xml:space="preserve"> that person’s </w:t>
+        <w:t xml:space="preserve">(b) a constable, a Police Community Support Officer, a person accredited under section 41 (accreditation under community safety accreditation schemes) of the Police Reform Act 2002, or a traffic officer, each acting in the course of that person’s </w:t>
       </w:r>
     </w:p>
     <w:p>
@@ -202,13 +170,8 @@
         </w:rPr>
         <w:tab/>
       </w:r>
-      <w:proofErr w:type="gramStart"/>
-      <w:r>
-        <w:t>duties;</w:t>
-      </w:r>
-      <w:proofErr w:type="gramEnd"/>
-      <w:r>
-        <w:t xml:space="preserve"> </w:t>
+      <w:r>
+        <w:t xml:space="preserve">duties; </w:t>
       </w:r>
       <w:r>
         <w:tab/>
@@ -219,23 +182,7 @@
         <w:ind w:left="1440" w:right="679" w:hanging="240"/>
       </w:pPr>
       <w:r>
-        <w:t>“</w:t>
-      </w:r>
-      <w:proofErr w:type="gramStart"/>
-      <w:r>
-        <w:t>the</w:t>
-      </w:r>
-      <w:proofErr w:type="gramEnd"/>
-      <w:r>
-        <w:t xml:space="preserve"> borough” means the borough of Cheltenham which is administered by the Council for the purposes of the Local Government Act 1972 from time to </w:t>
-      </w:r>
-      <w:proofErr w:type="gramStart"/>
-      <w:r>
-        <w:t>time;</w:t>
-      </w:r>
-      <w:proofErr w:type="gramEnd"/>
-      <w:r>
-        <w:t xml:space="preserve"> </w:t>
+        <w:t xml:space="preserve">“the borough” means the borough of Cheltenham which is administered by the Council for the purposes of the Local Government Act 1972 from time to time; </w:t>
       </w:r>
     </w:p>
     <w:p>
@@ -243,15 +190,7 @@
         <w:ind w:left="1210" w:right="679"/>
       </w:pPr>
       <w:r>
-        <w:t>“</w:t>
-      </w:r>
-      <w:proofErr w:type="gramStart"/>
-      <w:r>
-        <w:t>the</w:t>
-      </w:r>
-      <w:proofErr w:type="gramEnd"/>
-      <w:r>
-        <w:t xml:space="preserve"> Council” means Cheltenham Borough Council; and </w:t>
+        <w:t xml:space="preserve">“the Council” means Cheltenham Borough Council; and </w:t>
       </w:r>
     </w:p>
     <w:p>
@@ -260,15 +199,7 @@
         <w:ind w:left="1440" w:right="0" w:hanging="240"/>
       </w:pPr>
       <w:r>
-        <w:t>“</w:t>
-      </w:r>
-      <w:proofErr w:type="gramStart"/>
-      <w:r>
-        <w:t>traffic</w:t>
-      </w:r>
-      <w:proofErr w:type="gramEnd"/>
-      <w:r>
-        <w:t xml:space="preserve"> officer” means a person designated under section 2 of the Traffic </w:t>
+        <w:t xml:space="preserve">“traffic officer” means a person designated under section 2 of the Traffic </w:t>
       </w:r>
       <w:r>
         <w:rPr>
@@ -392,6 +323,107 @@
       <w:r>
         <w:t xml:space="preserve">A fixed penalty notice is a notice offering the person to whom it is issued the opportunity of discharging any liability to be convicted of the offence to which the notice relates by payment of a fixed penalty to the Council. </w:t>
       </w:r>
+      <w:r>
+        <w:t>After this should be one medium and one small image.</w:t>
+      </w:r>
+    </w:p>
+    <w:p>
+      <w:pPr>
+        <w:spacing w:after="164"/>
+        <w:ind w:left="720" w:right="679" w:firstLine="0"/>
+      </w:pPr>
+      <w:r>
+        <w:rPr>
+          <w:noProof/>
+        </w:rPr>
+        <w:drawing>
+          <wp:inline distT="0" distB="0" distL="0" distR="0" wp14:anchorId="3E48747B" wp14:editId="226B07C7">
+            <wp:extent cx="2449195" cy="1631520"/>
+            <wp:effectExtent l="0" t="0" r="8255" b="6985"/>
+            <wp:docPr id="4" name="Picture 7"/>
+            <wp:cNvGraphicFramePr>
+              <a:graphicFrameLocks xmlns:a="http://schemas.openxmlformats.org/drawingml/2006/main" noChangeAspect="1"/>
+            </wp:cNvGraphicFramePr>
+            <a:graphic xmlns:a="http://schemas.openxmlformats.org/drawingml/2006/main">
+              <a:graphicData uri="http://schemas.openxmlformats.org/drawingml/2006/picture">
+                <pic:pic xmlns:pic="http://schemas.openxmlformats.org/drawingml/2006/picture">
+                  <pic:nvPicPr>
+                    <pic:cNvPr id="1510766441" name="Picture 1510766441"/>
+                    <pic:cNvPicPr/>
+                  </pic:nvPicPr>
+                  <pic:blipFill>
+                    <a:blip r:embed="rId7" cstate="print">
+                      <a:extLst>
+                        <a:ext uri="{28A0092B-C50C-407E-A947-70E740481C1C}">
+                          <a14:useLocalDpi xmlns:a14="http://schemas.microsoft.com/office/drawing/2010/main" val="0"/>
+                        </a:ext>
+                      </a:extLst>
+                    </a:blip>
+                    <a:stretch>
+                      <a:fillRect/>
+                    </a:stretch>
+                  </pic:blipFill>
+                  <pic:spPr>
+                    <a:xfrm>
+                      <a:off x="0" y="0"/>
+                      <a:ext cx="2453827" cy="1634605"/>
+                    </a:xfrm>
+                    <a:prstGeom prst="rect">
+                      <a:avLst/>
+                    </a:prstGeom>
+                  </pic:spPr>
+                </pic:pic>
+              </a:graphicData>
+            </a:graphic>
+          </wp:inline>
+        </w:drawing>
+      </w:r>
+      <w:r>
+        <w:rPr>
+          <w:noProof/>
+        </w:rPr>
+        <w:drawing>
+          <wp:inline distT="0" distB="0" distL="0" distR="0" wp14:anchorId="0D0CA18D" wp14:editId="055B0265">
+            <wp:extent cx="1420495" cy="946256"/>
+            <wp:effectExtent l="0" t="0" r="8255" b="6350"/>
+            <wp:docPr id="5" name="Picture 7"/>
+            <wp:cNvGraphicFramePr>
+              <a:graphicFrameLocks xmlns:a="http://schemas.openxmlformats.org/drawingml/2006/main" noChangeAspect="1"/>
+            </wp:cNvGraphicFramePr>
+            <a:graphic xmlns:a="http://schemas.openxmlformats.org/drawingml/2006/main">
+              <a:graphicData uri="http://schemas.openxmlformats.org/drawingml/2006/picture">
+                <pic:pic xmlns:pic="http://schemas.openxmlformats.org/drawingml/2006/picture">
+                  <pic:nvPicPr>
+                    <pic:cNvPr id="1510766441" name="Picture 1510766441"/>
+                    <pic:cNvPicPr/>
+                  </pic:nvPicPr>
+                  <pic:blipFill>
+                    <a:blip r:embed="rId8" cstate="print">
+                      <a:extLst>
+                        <a:ext uri="{28A0092B-C50C-407E-A947-70E740481C1C}">
+                          <a14:useLocalDpi xmlns:a14="http://schemas.microsoft.com/office/drawing/2010/main" val="0"/>
+                        </a:ext>
+                      </a:extLst>
+                    </a:blip>
+                    <a:stretch>
+                      <a:fillRect/>
+                    </a:stretch>
+                  </pic:blipFill>
+                  <pic:spPr>
+                    <a:xfrm>
+                      <a:off x="0" y="0"/>
+                      <a:ext cx="1424636" cy="949014"/>
+                    </a:xfrm>
+                    <a:prstGeom prst="rect">
+                      <a:avLst/>
+                    </a:prstGeom>
+                  </pic:spPr>
+                </pic:pic>
+              </a:graphicData>
+            </a:graphic>
+          </wp:inline>
+        </w:drawing>
+      </w:r>
     </w:p>
     <w:p>
       <w:pPr>
@@ -415,15 +447,7 @@
         <w:ind w:right="679" w:hanging="521"/>
       </w:pPr>
       <w:r>
-        <w:t xml:space="preserve">the particulars of the circumstances alleged to constitute the offence to which the notice </w:t>
-      </w:r>
-      <w:proofErr w:type="gramStart"/>
-      <w:r>
-        <w:t>relates;</w:t>
-      </w:r>
-      <w:proofErr w:type="gramEnd"/>
-      <w:r>
-        <w:t xml:space="preserve"> </w:t>
+        <w:t xml:space="preserve">the particulars of the circumstances alleged to constitute the offence to which the notice relates; </w:t>
       </w:r>
     </w:p>
     <w:p>
@@ -436,15 +460,7 @@
         <w:ind w:right="679" w:hanging="521"/>
       </w:pPr>
       <w:r>
-        <w:t xml:space="preserve">the amount of the fixed </w:t>
-      </w:r>
-      <w:proofErr w:type="gramStart"/>
-      <w:r>
-        <w:t>penalty;</w:t>
-      </w:r>
-      <w:proofErr w:type="gramEnd"/>
-      <w:r>
-        <w:t xml:space="preserve"> </w:t>
+        <w:t xml:space="preserve">the amount of the fixed penalty; </w:t>
       </w:r>
     </w:p>
     <w:p>
@@ -457,15 +473,7 @@
         <w:ind w:right="679" w:hanging="521"/>
       </w:pPr>
       <w:r>
-        <w:t>the effect of subsection (6</w:t>
-      </w:r>
-      <w:proofErr w:type="gramStart"/>
-      <w:r>
-        <w:t>);</w:t>
-      </w:r>
-      <w:proofErr w:type="gramEnd"/>
-      <w:r>
-        <w:t xml:space="preserve"> </w:t>
+        <w:t xml:space="preserve">the effect of subsection (6); </w:t>
       </w:r>
     </w:p>
     <w:p>
@@ -557,6 +565,7 @@
         <w:ind w:right="679" w:hanging="521"/>
       </w:pPr>
       <w:r>
+        <w:lastRenderedPageBreak/>
         <w:t xml:space="preserve">the person may not be convicted of that offence if the fixed penalty is paid before the end of that period. </w:t>
       </w:r>
     </w:p>
@@ -609,7 +618,6 @@
         <w:ind w:right="679" w:hanging="497"/>
       </w:pPr>
       <w:r>
-        <w:lastRenderedPageBreak/>
         <w:t xml:space="preserve">In any proceedings, a certificate is evidence of the facts stated if it― </w:t>
       </w:r>
     </w:p>
@@ -710,12 +718,12 @@
       </w:pPr>
     </w:p>
     <w:sectPr>
-      <w:headerReference w:type="even" r:id="rId8"/>
-      <w:headerReference w:type="default" r:id="rId9"/>
-      <w:footerReference w:type="even" r:id="rId10"/>
-      <w:footerReference w:type="default" r:id="rId11"/>
-      <w:headerReference w:type="first" r:id="rId12"/>
-      <w:footerReference w:type="first" r:id="rId13"/>
+      <w:headerReference w:type="even" r:id="rId9"/>
+      <w:headerReference w:type="default" r:id="rId10"/>
+      <w:footerReference w:type="even" r:id="rId11"/>
+      <w:footerReference w:type="default" r:id="rId12"/>
+      <w:headerReference w:type="first" r:id="rId13"/>
+      <w:footerReference w:type="first" r:id="rId14"/>
       <w:pgSz w:w="11906" w:h="16838"/>
       <w:pgMar w:top="1440" w:right="1797" w:bottom="1440" w:left="1797" w:header="720" w:footer="720" w:gutter="0"/>
       <w:cols w:space="720"/>
@@ -725,7 +733,7 @@
 </file>
 
 <file path=word/endnotes.xml><?xml version="1.0" encoding="utf-8"?>
-<w:endnotes xmlns:wpc="http://schemas.microsoft.com/office/word/2010/wordprocessingCanvas" xmlns:cx="http://schemas.microsoft.com/office/drawing/2014/chartex" xmlns:cx1="http://schemas.microsoft.com/office/drawing/2015/9/8/chartex" xmlns:cx2="http://schemas.microsoft.com/office/drawing/2015/10/21/chartex" xmlns:cx3="http://schemas.microsoft.com/office/drawing/2016/5/9/chartex" xmlns:cx4="http://schemas.microsoft.com/office/drawing/2016/5/10/chartex" xmlns:cx5="http://schemas.microsoft.com/office/drawing/2016/5/11/chartex" xmlns:cx6="http://schemas.microsoft.com/office/drawing/2016/5/12/chartex" xmlns:cx7="http://schemas.microsoft.com/office/drawing/2016/5/13/chartex" xmlns:cx8="http://schemas.microsoft.com/office/drawing/2016/5/14/chartex" xmlns:mc="http://schemas.openxmlformats.org/markup-compatibility/2006" xmlns:aink="http://schemas.microsoft.com/office/drawing/2016/ink" xmlns:am3d="http://schemas.microsoft.com/office/drawing/2017/model3d" xmlns:o="urn:schemas-microsoft-com:office:office" xmlns:oel="http://schemas.microsoft.com/office/2019/extlst" xmlns:r="http://schemas.openxmlformats.org/officeDocument/2006/relationships" xmlns:m="http://schemas.openxmlformats.org/officeDocument/2006/math" xmlns:v="urn:schemas-microsoft-com:vml" xmlns:wp14="http://schemas.microsoft.com/office/word/2010/wordprocessingDrawing" xmlns:wp="http://schemas.openxmlformats.org/drawingml/2006/wordprocessingDrawing" xmlns:w10="urn:schemas-microsoft-com:office:word" xmlns:w="http://schemas.openxmlformats.org/wordprocessingml/2006/main" xmlns:w14="http://schemas.microsoft.com/office/word/2010/wordml" xmlns:w15="http://schemas.microsoft.com/office/word/2012/wordml" xmlns:w16cex="http://schemas.microsoft.com/office/word/2018/wordml/cex" xmlns:w16cid="http://schemas.microsoft.com/office/word/2016/wordml/cid" xmlns:w16="http://schemas.microsoft.com/office/word/2018/wordml" xmlns:w16du="http://schemas.microsoft.com/office/word/2023/wordml/word16du" xmlns:w16sdtdh="http://schemas.microsoft.com/office/word/2020/wordml/sdtdatahash" xmlns:w16sdtfl="http://schemas.microsoft.com/office/word/2024/wordml/sdtformatlock" xmlns:w16se="http://schemas.microsoft.com/office/word/2015/wordml/symex" xmlns:wpg="http://schemas.microsoft.com/office/word/2010/wordprocessingGroup" xmlns:wpi="http://schemas.microsoft.com/office/word/2010/wordprocessingInk" xmlns:wne="http://schemas.microsoft.com/office/word/2006/wordml" xmlns:wps="http://schemas.microsoft.com/office/word/2010/wordprocessingShape" mc:Ignorable="w14 w15 w16se w16cid w16 w16cex w16sdtdh w16sdtfl w16du wp14">
+<w:endnotes xmlns:wpc="http://schemas.microsoft.com/office/word/2010/wordprocessingCanvas" xmlns:cx="http://schemas.microsoft.com/office/drawing/2014/chartex" xmlns:cx1="http://schemas.microsoft.com/office/drawing/2015/9/8/chartex" xmlns:cx2="http://schemas.microsoft.com/office/drawing/2015/10/21/chartex" xmlns:cx3="http://schemas.microsoft.com/office/drawing/2016/5/9/chartex" xmlns:cx4="http://schemas.microsoft.com/office/drawing/2016/5/10/chartex" xmlns:cx5="http://schemas.microsoft.com/office/drawing/2016/5/11/chartex" xmlns:cx6="http://schemas.microsoft.com/office/drawing/2016/5/12/chartex" xmlns:cx7="http://schemas.microsoft.com/office/drawing/2016/5/13/chartex" xmlns:cx8="http://schemas.microsoft.com/office/drawing/2016/5/14/chartex" xmlns:mc="http://schemas.openxmlformats.org/markup-compatibility/2006" xmlns:aink="http://schemas.microsoft.com/office/drawing/2016/ink" xmlns:am3d="http://schemas.microsoft.com/office/drawing/2017/model3d" xmlns:o="urn:schemas-microsoft-com:office:office" xmlns:r="http://schemas.openxmlformats.org/officeDocument/2006/relationships" xmlns:m="http://schemas.openxmlformats.org/officeDocument/2006/math" xmlns:v="urn:schemas-microsoft-com:vml" xmlns:wp14="http://schemas.microsoft.com/office/word/2010/wordprocessingDrawing" xmlns:wp="http://schemas.openxmlformats.org/drawingml/2006/wordprocessingDrawing" xmlns:w10="urn:schemas-microsoft-com:office:word" xmlns:w="http://schemas.openxmlformats.org/wordprocessingml/2006/main" xmlns:w14="http://schemas.microsoft.com/office/word/2010/wordml" xmlns:w15="http://schemas.microsoft.com/office/word/2012/wordml" xmlns:w16cex="http://schemas.microsoft.com/office/word/2018/wordml/cex" xmlns:w16cid="http://schemas.microsoft.com/office/word/2016/wordml/cid" xmlns:w16="http://schemas.microsoft.com/office/word/2018/wordml" xmlns:w16sdtdh="http://schemas.microsoft.com/office/word/2020/wordml/sdtdatahash" xmlns:w16se="http://schemas.microsoft.com/office/word/2015/wordml/symex" xmlns:wpg="http://schemas.microsoft.com/office/word/2010/wordprocessingGroup" xmlns:wpi="http://schemas.microsoft.com/office/word/2010/wordprocessingInk" xmlns:wne="http://schemas.microsoft.com/office/word/2006/wordml" xmlns:wps="http://schemas.microsoft.com/office/word/2010/wordprocessingShape" mc:Ignorable="w14 w15 w16se w16cid w16 w16cex w16sdtdh wp14">
   <w:endnote w:type="separator" w:id="-1">
     <w:p>
       <w:pPr>
@@ -750,7 +758,7 @@
 </file>
 
 <file path=word/footer1.xml><?xml version="1.0" encoding="utf-8"?>
-<w:ftr xmlns:wpc="http://schemas.microsoft.com/office/word/2010/wordprocessingCanvas" xmlns:cx="http://schemas.microsoft.com/office/drawing/2014/chartex" xmlns:cx1="http://schemas.microsoft.com/office/drawing/2015/9/8/chartex" xmlns:cx2="http://schemas.microsoft.com/office/drawing/2015/10/21/chartex" xmlns:cx3="http://schemas.microsoft.com/office/drawing/2016/5/9/chartex" xmlns:cx4="http://schemas.microsoft.com/office/drawing/2016/5/10/chartex" xmlns:cx5="http://schemas.microsoft.com/office/drawing/2016/5/11/chartex" xmlns:cx6="http://schemas.microsoft.com/office/drawing/2016/5/12/chartex" xmlns:cx7="http://schemas.microsoft.com/office/drawing/2016/5/13/chartex" xmlns:cx8="http://schemas.microsoft.com/office/drawing/2016/5/14/chartex" xmlns:mc="http://schemas.openxmlformats.org/markup-compatibility/2006" xmlns:aink="http://schemas.microsoft.com/office/drawing/2016/ink" xmlns:am3d="http://schemas.microsoft.com/office/drawing/2017/model3d" xmlns:o="urn:schemas-microsoft-com:office:office" xmlns:oel="http://schemas.microsoft.com/office/2019/extlst" xmlns:r="http://schemas.openxmlformats.org/officeDocument/2006/relationships" xmlns:m="http://schemas.openxmlformats.org/officeDocument/2006/math" xmlns:v="urn:schemas-microsoft-com:vml" xmlns:wp14="http://schemas.microsoft.com/office/word/2010/wordprocessingDrawing" xmlns:wp="http://schemas.openxmlformats.org/drawingml/2006/wordprocessingDrawing" xmlns:w10="urn:schemas-microsoft-com:office:word" xmlns:w="http://schemas.openxmlformats.org/wordprocessingml/2006/main" xmlns:w14="http://schemas.microsoft.com/office/word/2010/wordml" xmlns:w15="http://schemas.microsoft.com/office/word/2012/wordml" xmlns:w16cex="http://schemas.microsoft.com/office/word/2018/wordml/cex" xmlns:w16cid="http://schemas.microsoft.com/office/word/2016/wordml/cid" xmlns:w16="http://schemas.microsoft.com/office/word/2018/wordml" xmlns:w16du="http://schemas.microsoft.com/office/word/2023/wordml/word16du" xmlns:w16sdtdh="http://schemas.microsoft.com/office/word/2020/wordml/sdtdatahash" xmlns:w16sdtfl="http://schemas.microsoft.com/office/word/2024/wordml/sdtformatlock" xmlns:w16se="http://schemas.microsoft.com/office/word/2015/wordml/symex" xmlns:wpg="http://schemas.microsoft.com/office/word/2010/wordprocessingGroup" xmlns:wpi="http://schemas.microsoft.com/office/word/2010/wordprocessingInk" xmlns:wne="http://schemas.microsoft.com/office/word/2006/wordml" xmlns:wps="http://schemas.microsoft.com/office/word/2010/wordprocessingShape" mc:Ignorable="w14 w15 w16se w16cid w16 w16cex w16sdtdh w16sdtfl w16du wp14">
+<w:ftr xmlns:wpc="http://schemas.microsoft.com/office/word/2010/wordprocessingCanvas" xmlns:cx="http://schemas.microsoft.com/office/drawing/2014/chartex" xmlns:cx1="http://schemas.microsoft.com/office/drawing/2015/9/8/chartex" xmlns:cx2="http://schemas.microsoft.com/office/drawing/2015/10/21/chartex" xmlns:cx3="http://schemas.microsoft.com/office/drawing/2016/5/9/chartex" xmlns:cx4="http://schemas.microsoft.com/office/drawing/2016/5/10/chartex" xmlns:cx5="http://schemas.microsoft.com/office/drawing/2016/5/11/chartex" xmlns:cx6="http://schemas.microsoft.com/office/drawing/2016/5/12/chartex" xmlns:cx7="http://schemas.microsoft.com/office/drawing/2016/5/13/chartex" xmlns:cx8="http://schemas.microsoft.com/office/drawing/2016/5/14/chartex" xmlns:mc="http://schemas.openxmlformats.org/markup-compatibility/2006" xmlns:aink="http://schemas.microsoft.com/office/drawing/2016/ink" xmlns:am3d="http://schemas.microsoft.com/office/drawing/2017/model3d" xmlns:o="urn:schemas-microsoft-com:office:office" xmlns:r="http://schemas.openxmlformats.org/officeDocument/2006/relationships" xmlns:m="http://schemas.openxmlformats.org/officeDocument/2006/math" xmlns:v="urn:schemas-microsoft-com:vml" xmlns:wp14="http://schemas.microsoft.com/office/word/2010/wordprocessingDrawing" xmlns:wp="http://schemas.openxmlformats.org/drawingml/2006/wordprocessingDrawing" xmlns:w10="urn:schemas-microsoft-com:office:word" xmlns:w="http://schemas.openxmlformats.org/wordprocessingml/2006/main" xmlns:w14="http://schemas.microsoft.com/office/word/2010/wordml" xmlns:w15="http://schemas.microsoft.com/office/word/2012/wordml" xmlns:w16cex="http://schemas.microsoft.com/office/word/2018/wordml/cex" xmlns:w16cid="http://schemas.microsoft.com/office/word/2016/wordml/cid" xmlns:w16="http://schemas.microsoft.com/office/word/2018/wordml" xmlns:w16sdtdh="http://schemas.microsoft.com/office/word/2020/wordml/sdtdatahash" xmlns:w16se="http://schemas.microsoft.com/office/word/2015/wordml/symex" xmlns:wpg="http://schemas.microsoft.com/office/word/2010/wordprocessingGroup" xmlns:wpi="http://schemas.microsoft.com/office/word/2010/wordprocessingInk" xmlns:wne="http://schemas.microsoft.com/office/word/2006/wordml" xmlns:wps="http://schemas.microsoft.com/office/word/2010/wordprocessingShape" mc:Ignorable="w14 w15 w16se w16cid w16 w16cex w16sdtdh wp14">
   <w:p>
     <w:pPr>
       <w:pStyle w:val="Footer"/>
@@ -834,7 +842,7 @@
             </wp:anchor>
           </w:drawing>
         </mc:Choice>
-        <mc:Fallback>
+        <mc:Fallback xmlns:oel="http://schemas.microsoft.com/office/2019/extlst" xmlns:w16du="http://schemas.microsoft.com/office/word/2023/wordml/word16du" xmlns:w16sdtfl="http://schemas.microsoft.com/office/word/2024/wordml/sdtformatlock">
           <w:pict>
             <v:shapetype w14:anchorId="3E6B7B9A" id="_x0000_t202" coordsize="21600,21600" o:spt="202" path="m,l,21600r21600,l21600,xe">
               <v:stroke joinstyle="miter"/>
@@ -877,7 +885,7 @@
 </file>
 
 <file path=word/footer2.xml><?xml version="1.0" encoding="utf-8"?>
-<w:ftr xmlns:wpc="http://schemas.microsoft.com/office/word/2010/wordprocessingCanvas" xmlns:cx="http://schemas.microsoft.com/office/drawing/2014/chartex" xmlns:cx1="http://schemas.microsoft.com/office/drawing/2015/9/8/chartex" xmlns:cx2="http://schemas.microsoft.com/office/drawing/2015/10/21/chartex" xmlns:cx3="http://schemas.microsoft.com/office/drawing/2016/5/9/chartex" xmlns:cx4="http://schemas.microsoft.com/office/drawing/2016/5/10/chartex" xmlns:cx5="http://schemas.microsoft.com/office/drawing/2016/5/11/chartex" xmlns:cx6="http://schemas.microsoft.com/office/drawing/2016/5/12/chartex" xmlns:cx7="http://schemas.microsoft.com/office/drawing/2016/5/13/chartex" xmlns:cx8="http://schemas.microsoft.com/office/drawing/2016/5/14/chartex" xmlns:mc="http://schemas.openxmlformats.org/markup-compatibility/2006" xmlns:aink="http://schemas.microsoft.com/office/drawing/2016/ink" xmlns:am3d="http://schemas.microsoft.com/office/drawing/2017/model3d" xmlns:o="urn:schemas-microsoft-com:office:office" xmlns:oel="http://schemas.microsoft.com/office/2019/extlst" xmlns:r="http://schemas.openxmlformats.org/officeDocument/2006/relationships" xmlns:m="http://schemas.openxmlformats.org/officeDocument/2006/math" xmlns:v="urn:schemas-microsoft-com:vml" xmlns:wp14="http://schemas.microsoft.com/office/word/2010/wordprocessingDrawing" xmlns:wp="http://schemas.openxmlformats.org/drawingml/2006/wordprocessingDrawing" xmlns:w10="urn:schemas-microsoft-com:office:word" xmlns:w="http://schemas.openxmlformats.org/wordprocessingml/2006/main" xmlns:w14="http://schemas.microsoft.com/office/word/2010/wordml" xmlns:w15="http://schemas.microsoft.com/office/word/2012/wordml" xmlns:w16cex="http://schemas.microsoft.com/office/word/2018/wordml/cex" xmlns:w16cid="http://schemas.microsoft.com/office/word/2016/wordml/cid" xmlns:w16="http://schemas.microsoft.com/office/word/2018/wordml" xmlns:w16du="http://schemas.microsoft.com/office/word/2023/wordml/word16du" xmlns:w16sdtdh="http://schemas.microsoft.com/office/word/2020/wordml/sdtdatahash" xmlns:w16sdtfl="http://schemas.microsoft.com/office/word/2024/wordml/sdtformatlock" xmlns:w16se="http://schemas.microsoft.com/office/word/2015/wordml/symex" xmlns:wpg="http://schemas.microsoft.com/office/word/2010/wordprocessingGroup" xmlns:wpi="http://schemas.microsoft.com/office/word/2010/wordprocessingInk" xmlns:wne="http://schemas.microsoft.com/office/word/2006/wordml" xmlns:wps="http://schemas.microsoft.com/office/word/2010/wordprocessingShape" mc:Ignorable="w14 w15 w16se w16cid w16 w16cex w16sdtdh w16sdtfl w16du wp14">
+<w:ftr xmlns:wpc="http://schemas.microsoft.com/office/word/2010/wordprocessingCanvas" xmlns:cx="http://schemas.microsoft.com/office/drawing/2014/chartex" xmlns:cx1="http://schemas.microsoft.com/office/drawing/2015/9/8/chartex" xmlns:cx2="http://schemas.microsoft.com/office/drawing/2015/10/21/chartex" xmlns:cx3="http://schemas.microsoft.com/office/drawing/2016/5/9/chartex" xmlns:cx4="http://schemas.microsoft.com/office/drawing/2016/5/10/chartex" xmlns:cx5="http://schemas.microsoft.com/office/drawing/2016/5/11/chartex" xmlns:cx6="http://schemas.microsoft.com/office/drawing/2016/5/12/chartex" xmlns:cx7="http://schemas.microsoft.com/office/drawing/2016/5/13/chartex" xmlns:cx8="http://schemas.microsoft.com/office/drawing/2016/5/14/chartex" xmlns:mc="http://schemas.openxmlformats.org/markup-compatibility/2006" xmlns:aink="http://schemas.microsoft.com/office/drawing/2016/ink" xmlns:am3d="http://schemas.microsoft.com/office/drawing/2017/model3d" xmlns:o="urn:schemas-microsoft-com:office:office" xmlns:r="http://schemas.openxmlformats.org/officeDocument/2006/relationships" xmlns:m="http://schemas.openxmlformats.org/officeDocument/2006/math" xmlns:v="urn:schemas-microsoft-com:vml" xmlns:wp14="http://schemas.microsoft.com/office/word/2010/wordprocessingDrawing" xmlns:wp="http://schemas.openxmlformats.org/drawingml/2006/wordprocessingDrawing" xmlns:w10="urn:schemas-microsoft-com:office:word" xmlns:w="http://schemas.openxmlformats.org/wordprocessingml/2006/main" xmlns:w14="http://schemas.microsoft.com/office/word/2010/wordml" xmlns:w15="http://schemas.microsoft.com/office/word/2012/wordml" xmlns:w16cex="http://schemas.microsoft.com/office/word/2018/wordml/cex" xmlns:w16cid="http://schemas.microsoft.com/office/word/2016/wordml/cid" xmlns:w16="http://schemas.microsoft.com/office/word/2018/wordml" xmlns:w16sdtdh="http://schemas.microsoft.com/office/word/2020/wordml/sdtdatahash" xmlns:w16se="http://schemas.microsoft.com/office/word/2015/wordml/symex" xmlns:wpg="http://schemas.microsoft.com/office/word/2010/wordprocessingGroup" xmlns:wpi="http://schemas.microsoft.com/office/word/2010/wordprocessingInk" xmlns:wne="http://schemas.microsoft.com/office/word/2006/wordml" xmlns:wps="http://schemas.microsoft.com/office/word/2010/wordprocessingShape" mc:Ignorable="w14 w15 w16se w16cid w16 w16cex w16sdtdh wp14">
   <w:p>
     <w:pPr>
       <w:pStyle w:val="Footer"/>
@@ -961,7 +969,7 @@
             </wp:anchor>
           </w:drawing>
         </mc:Choice>
-        <mc:Fallback>
+        <mc:Fallback xmlns:oel="http://schemas.microsoft.com/office/2019/extlst" xmlns:w16du="http://schemas.microsoft.com/office/word/2023/wordml/word16du" xmlns:w16sdtfl="http://schemas.microsoft.com/office/word/2024/wordml/sdtformatlock">
           <w:pict>
             <v:shapetype w14:anchorId="7EA19752" id="_x0000_t202" coordsize="21600,21600" o:spt="202" path="m,l,21600r21600,l21600,xe">
               <v:stroke joinstyle="miter"/>
@@ -1004,7 +1012,7 @@
 </file>
 
 <file path=word/footer3.xml><?xml version="1.0" encoding="utf-8"?>
-<w:ftr xmlns:wpc="http://schemas.microsoft.com/office/word/2010/wordprocessingCanvas" xmlns:cx="http://schemas.microsoft.com/office/drawing/2014/chartex" xmlns:cx1="http://schemas.microsoft.com/office/drawing/2015/9/8/chartex" xmlns:cx2="http://schemas.microsoft.com/office/drawing/2015/10/21/chartex" xmlns:cx3="http://schemas.microsoft.com/office/drawing/2016/5/9/chartex" xmlns:cx4="http://schemas.microsoft.com/office/drawing/2016/5/10/chartex" xmlns:cx5="http://schemas.microsoft.com/office/drawing/2016/5/11/chartex" xmlns:cx6="http://schemas.microsoft.com/office/drawing/2016/5/12/chartex" xmlns:cx7="http://schemas.microsoft.com/office/drawing/2016/5/13/chartex" xmlns:cx8="http://schemas.microsoft.com/office/drawing/2016/5/14/chartex" xmlns:mc="http://schemas.openxmlformats.org/markup-compatibility/2006" xmlns:aink="http://schemas.microsoft.com/office/drawing/2016/ink" xmlns:am3d="http://schemas.microsoft.com/office/drawing/2017/model3d" xmlns:o="urn:schemas-microsoft-com:office:office" xmlns:oel="http://schemas.microsoft.com/office/2019/extlst" xmlns:r="http://schemas.openxmlformats.org/officeDocument/2006/relationships" xmlns:m="http://schemas.openxmlformats.org/officeDocument/2006/math" xmlns:v="urn:schemas-microsoft-com:vml" xmlns:wp14="http://schemas.microsoft.com/office/word/2010/wordprocessingDrawing" xmlns:wp="http://schemas.openxmlformats.org/drawingml/2006/wordprocessingDrawing" xmlns:w10="urn:schemas-microsoft-com:office:word" xmlns:w="http://schemas.openxmlformats.org/wordprocessingml/2006/main" xmlns:w14="http://schemas.microsoft.com/office/word/2010/wordml" xmlns:w15="http://schemas.microsoft.com/office/word/2012/wordml" xmlns:w16cex="http://schemas.microsoft.com/office/word/2018/wordml/cex" xmlns:w16cid="http://schemas.microsoft.com/office/word/2016/wordml/cid" xmlns:w16="http://schemas.microsoft.com/office/word/2018/wordml" xmlns:w16du="http://schemas.microsoft.com/office/word/2023/wordml/word16du" xmlns:w16sdtdh="http://schemas.microsoft.com/office/word/2020/wordml/sdtdatahash" xmlns:w16sdtfl="http://schemas.microsoft.com/office/word/2024/wordml/sdtformatlock" xmlns:w16se="http://schemas.microsoft.com/office/word/2015/wordml/symex" xmlns:wpg="http://schemas.microsoft.com/office/word/2010/wordprocessingGroup" xmlns:wpi="http://schemas.microsoft.com/office/word/2010/wordprocessingInk" xmlns:wne="http://schemas.microsoft.com/office/word/2006/wordml" xmlns:wps="http://schemas.microsoft.com/office/word/2010/wordprocessingShape" mc:Ignorable="w14 w15 w16se w16cid w16 w16cex w16sdtdh w16sdtfl w16du wp14">
+<w:ftr xmlns:wpc="http://schemas.microsoft.com/office/word/2010/wordprocessingCanvas" xmlns:cx="http://schemas.microsoft.com/office/drawing/2014/chartex" xmlns:cx1="http://schemas.microsoft.com/office/drawing/2015/9/8/chartex" xmlns:cx2="http://schemas.microsoft.com/office/drawing/2015/10/21/chartex" xmlns:cx3="http://schemas.microsoft.com/office/drawing/2016/5/9/chartex" xmlns:cx4="http://schemas.microsoft.com/office/drawing/2016/5/10/chartex" xmlns:cx5="http://schemas.microsoft.com/office/drawing/2016/5/11/chartex" xmlns:cx6="http://schemas.microsoft.com/office/drawing/2016/5/12/chartex" xmlns:cx7="http://schemas.microsoft.com/office/drawing/2016/5/13/chartex" xmlns:cx8="http://schemas.microsoft.com/office/drawing/2016/5/14/chartex" xmlns:mc="http://schemas.openxmlformats.org/markup-compatibility/2006" xmlns:aink="http://schemas.microsoft.com/office/drawing/2016/ink" xmlns:am3d="http://schemas.microsoft.com/office/drawing/2017/model3d" xmlns:o="urn:schemas-microsoft-com:office:office" xmlns:r="http://schemas.openxmlformats.org/officeDocument/2006/relationships" xmlns:m="http://schemas.openxmlformats.org/officeDocument/2006/math" xmlns:v="urn:schemas-microsoft-com:vml" xmlns:wp14="http://schemas.microsoft.com/office/word/2010/wordprocessingDrawing" xmlns:wp="http://schemas.openxmlformats.org/drawingml/2006/wordprocessingDrawing" xmlns:w10="urn:schemas-microsoft-com:office:word" xmlns:w="http://schemas.openxmlformats.org/wordprocessingml/2006/main" xmlns:w14="http://schemas.microsoft.com/office/word/2010/wordml" xmlns:w15="http://schemas.microsoft.com/office/word/2012/wordml" xmlns:w16cex="http://schemas.microsoft.com/office/word/2018/wordml/cex" xmlns:w16cid="http://schemas.microsoft.com/office/word/2016/wordml/cid" xmlns:w16="http://schemas.microsoft.com/office/word/2018/wordml" xmlns:w16sdtdh="http://schemas.microsoft.com/office/word/2020/wordml/sdtdatahash" xmlns:w16se="http://schemas.microsoft.com/office/word/2015/wordml/symex" xmlns:wpg="http://schemas.microsoft.com/office/word/2010/wordprocessingGroup" xmlns:wpi="http://schemas.microsoft.com/office/word/2010/wordprocessingInk" xmlns:wne="http://schemas.microsoft.com/office/word/2006/wordml" xmlns:wps="http://schemas.microsoft.com/office/word/2010/wordprocessingShape" mc:Ignorable="w14 w15 w16se w16cid w16 w16cex w16sdtdh wp14">
   <w:p>
     <w:pPr>
       <w:pStyle w:val="Footer"/>
@@ -1088,7 +1096,7 @@
             </wp:anchor>
           </w:drawing>
         </mc:Choice>
-        <mc:Fallback>
+        <mc:Fallback xmlns:oel="http://schemas.microsoft.com/office/2019/extlst" xmlns:w16du="http://schemas.microsoft.com/office/word/2023/wordml/word16du" xmlns:w16sdtfl="http://schemas.microsoft.com/office/word/2024/wordml/sdtformatlock">
           <w:pict>
             <v:shapetype w14:anchorId="73760186" id="_x0000_t202" coordsize="21600,21600" o:spt="202" path="m,l,21600r21600,l21600,xe">
               <v:stroke joinstyle="miter"/>
@@ -1131,7 +1139,7 @@
 </file>
 
 <file path=word/footnotes.xml><?xml version="1.0" encoding="utf-8"?>
-<w:footnotes xmlns:wpc="http://schemas.microsoft.com/office/word/2010/wordprocessingCanvas" xmlns:cx="http://schemas.microsoft.com/office/drawing/2014/chartex" xmlns:cx1="http://schemas.microsoft.com/office/drawing/2015/9/8/chartex" xmlns:cx2="http://schemas.microsoft.com/office/drawing/2015/10/21/chartex" xmlns:cx3="http://schemas.microsoft.com/office/drawing/2016/5/9/chartex" xmlns:cx4="http://schemas.microsoft.com/office/drawing/2016/5/10/chartex" xmlns:cx5="http://schemas.microsoft.com/office/drawing/2016/5/11/chartex" xmlns:cx6="http://schemas.microsoft.com/office/drawing/2016/5/12/chartex" xmlns:cx7="http://schemas.microsoft.com/office/drawing/2016/5/13/chartex" xmlns:cx8="http://schemas.microsoft.com/office/drawing/2016/5/14/chartex" xmlns:mc="http://schemas.openxmlformats.org/markup-compatibility/2006" xmlns:aink="http://schemas.microsoft.com/office/drawing/2016/ink" xmlns:am3d="http://schemas.microsoft.com/office/drawing/2017/model3d" xmlns:o="urn:schemas-microsoft-com:office:office" xmlns:oel="http://schemas.microsoft.com/office/2019/extlst" xmlns:r="http://schemas.openxmlformats.org/officeDocument/2006/relationships" xmlns:m="http://schemas.openxmlformats.org/officeDocument/2006/math" xmlns:v="urn:schemas-microsoft-com:vml" xmlns:wp14="http://schemas.microsoft.com/office/word/2010/wordprocessingDrawing" xmlns:wp="http://schemas.openxmlformats.org/drawingml/2006/wordprocessingDrawing" xmlns:w10="urn:schemas-microsoft-com:office:word" xmlns:w="http://schemas.openxmlformats.org/wordprocessingml/2006/main" xmlns:w14="http://schemas.microsoft.com/office/word/2010/wordml" xmlns:w15="http://schemas.microsoft.com/office/word/2012/wordml" xmlns:w16cex="http://schemas.microsoft.com/office/word/2018/wordml/cex" xmlns:w16cid="http://schemas.microsoft.com/office/word/2016/wordml/cid" xmlns:w16="http://schemas.microsoft.com/office/word/2018/wordml" xmlns:w16du="http://schemas.microsoft.com/office/word/2023/wordml/word16du" xmlns:w16sdtdh="http://schemas.microsoft.com/office/word/2020/wordml/sdtdatahash" xmlns:w16sdtfl="http://schemas.microsoft.com/office/word/2024/wordml/sdtformatlock" xmlns:w16se="http://schemas.microsoft.com/office/word/2015/wordml/symex" xmlns:wpg="http://schemas.microsoft.com/office/word/2010/wordprocessingGroup" xmlns:wpi="http://schemas.microsoft.com/office/word/2010/wordprocessingInk" xmlns:wne="http://schemas.microsoft.com/office/word/2006/wordml" xmlns:wps="http://schemas.microsoft.com/office/word/2010/wordprocessingShape" mc:Ignorable="w14 w15 w16se w16cid w16 w16cex w16sdtdh w16sdtfl w16du wp14">
+<w:footnotes xmlns:wpc="http://schemas.microsoft.com/office/word/2010/wordprocessingCanvas" xmlns:cx="http://schemas.microsoft.com/office/drawing/2014/chartex" xmlns:cx1="http://schemas.microsoft.com/office/drawing/2015/9/8/chartex" xmlns:cx2="http://schemas.microsoft.com/office/drawing/2015/10/21/chartex" xmlns:cx3="http://schemas.microsoft.com/office/drawing/2016/5/9/chartex" xmlns:cx4="http://schemas.microsoft.com/office/drawing/2016/5/10/chartex" xmlns:cx5="http://schemas.microsoft.com/office/drawing/2016/5/11/chartex" xmlns:cx6="http://schemas.microsoft.com/office/drawing/2016/5/12/chartex" xmlns:cx7="http://schemas.microsoft.com/office/drawing/2016/5/13/chartex" xmlns:cx8="http://schemas.microsoft.com/office/drawing/2016/5/14/chartex" xmlns:mc="http://schemas.openxmlformats.org/markup-compatibility/2006" xmlns:aink="http://schemas.microsoft.com/office/drawing/2016/ink" xmlns:am3d="http://schemas.microsoft.com/office/drawing/2017/model3d" xmlns:o="urn:schemas-microsoft-com:office:office" xmlns:r="http://schemas.openxmlformats.org/officeDocument/2006/relationships" xmlns:m="http://schemas.openxmlformats.org/officeDocument/2006/math" xmlns:v="urn:schemas-microsoft-com:vml" xmlns:wp14="http://schemas.microsoft.com/office/word/2010/wordprocessingDrawing" xmlns:wp="http://schemas.openxmlformats.org/drawingml/2006/wordprocessingDrawing" xmlns:w10="urn:schemas-microsoft-com:office:word" xmlns:w="http://schemas.openxmlformats.org/wordprocessingml/2006/main" xmlns:w14="http://schemas.microsoft.com/office/word/2010/wordml" xmlns:w15="http://schemas.microsoft.com/office/word/2012/wordml" xmlns:w16cex="http://schemas.microsoft.com/office/word/2018/wordml/cex" xmlns:w16cid="http://schemas.microsoft.com/office/word/2016/wordml/cid" xmlns:w16="http://schemas.microsoft.com/office/word/2018/wordml" xmlns:w16sdtdh="http://schemas.microsoft.com/office/word/2020/wordml/sdtdatahash" xmlns:w16se="http://schemas.microsoft.com/office/word/2015/wordml/symex" xmlns:wpg="http://schemas.microsoft.com/office/word/2010/wordprocessingGroup" xmlns:wpi="http://schemas.microsoft.com/office/word/2010/wordprocessingInk" xmlns:wne="http://schemas.microsoft.com/office/word/2006/wordml" xmlns:wps="http://schemas.microsoft.com/office/word/2010/wordprocessingShape" mc:Ignorable="w14 w15 w16se w16cid w16 w16cex w16sdtdh wp14">
   <w:footnote w:type="separator" w:id="-1">
     <w:p>
       <w:pPr>
@@ -1156,7 +1164,7 @@
 </file>
 
 <file path=word/header1.xml><?xml version="1.0" encoding="utf-8"?>
-<w:hdr xmlns:wpc="http://schemas.microsoft.com/office/word/2010/wordprocessingCanvas" xmlns:cx="http://schemas.microsoft.com/office/drawing/2014/chartex" xmlns:cx1="http://schemas.microsoft.com/office/drawing/2015/9/8/chartex" xmlns:cx2="http://schemas.microsoft.com/office/drawing/2015/10/21/chartex" xmlns:cx3="http://schemas.microsoft.com/office/drawing/2016/5/9/chartex" xmlns:cx4="http://schemas.microsoft.com/office/drawing/2016/5/10/chartex" xmlns:cx5="http://schemas.microsoft.com/office/drawing/2016/5/11/chartex" xmlns:cx6="http://schemas.microsoft.com/office/drawing/2016/5/12/chartex" xmlns:cx7="http://schemas.microsoft.com/office/drawing/2016/5/13/chartex" xmlns:cx8="http://schemas.microsoft.com/office/drawing/2016/5/14/chartex" xmlns:mc="http://schemas.openxmlformats.org/markup-compatibility/2006" xmlns:aink="http://schemas.microsoft.com/office/drawing/2016/ink" xmlns:am3d="http://schemas.microsoft.com/office/drawing/2017/model3d" xmlns:o="urn:schemas-microsoft-com:office:office" xmlns:oel="http://schemas.microsoft.com/office/2019/extlst" xmlns:r="http://schemas.openxmlformats.org/officeDocument/2006/relationships" xmlns:m="http://schemas.openxmlformats.org/officeDocument/2006/math" xmlns:v="urn:schemas-microsoft-com:vml" xmlns:wp14="http://schemas.microsoft.com/office/word/2010/wordprocessingDrawing" xmlns:wp="http://schemas.openxmlformats.org/drawingml/2006/wordprocessingDrawing" xmlns:w10="urn:schemas-microsoft-com:office:word" xmlns:w="http://schemas.openxmlformats.org/wordprocessingml/2006/main" xmlns:w14="http://schemas.microsoft.com/office/word/2010/wordml" xmlns:w15="http://schemas.microsoft.com/office/word/2012/wordml" xmlns:w16cex="http://schemas.microsoft.com/office/word/2018/wordml/cex" xmlns:w16cid="http://schemas.microsoft.com/office/word/2016/wordml/cid" xmlns:w16="http://schemas.microsoft.com/office/word/2018/wordml" xmlns:w16du="http://schemas.microsoft.com/office/word/2023/wordml/word16du" xmlns:w16sdtdh="http://schemas.microsoft.com/office/word/2020/wordml/sdtdatahash" xmlns:w16sdtfl="http://schemas.microsoft.com/office/word/2024/wordml/sdtformatlock" xmlns:w16se="http://schemas.microsoft.com/office/word/2015/wordml/symex" xmlns:wpg="http://schemas.microsoft.com/office/word/2010/wordprocessingGroup" xmlns:wpi="http://schemas.microsoft.com/office/word/2010/wordprocessingInk" xmlns:wne="http://schemas.microsoft.com/office/word/2006/wordml" xmlns:wps="http://schemas.microsoft.com/office/word/2010/wordprocessingShape" mc:Ignorable="w14 w15 w16se w16cid w16 w16cex w16sdtdh w16sdtfl w16du wp14">
+<w:hdr xmlns:wpc="http://schemas.microsoft.com/office/word/2010/wordprocessingCanvas" xmlns:cx="http://schemas.microsoft.com/office/drawing/2014/chartex" xmlns:cx1="http://schemas.microsoft.com/office/drawing/2015/9/8/chartex" xmlns:cx2="http://schemas.microsoft.com/office/drawing/2015/10/21/chartex" xmlns:cx3="http://schemas.microsoft.com/office/drawing/2016/5/9/chartex" xmlns:cx4="http://schemas.microsoft.com/office/drawing/2016/5/10/chartex" xmlns:cx5="http://schemas.microsoft.com/office/drawing/2016/5/11/chartex" xmlns:cx6="http://schemas.microsoft.com/office/drawing/2016/5/12/chartex" xmlns:cx7="http://schemas.microsoft.com/office/drawing/2016/5/13/chartex" xmlns:cx8="http://schemas.microsoft.com/office/drawing/2016/5/14/chartex" xmlns:mc="http://schemas.openxmlformats.org/markup-compatibility/2006" xmlns:aink="http://schemas.microsoft.com/office/drawing/2016/ink" xmlns:am3d="http://schemas.microsoft.com/office/drawing/2017/model3d" xmlns:o="urn:schemas-microsoft-com:office:office" xmlns:r="http://schemas.openxmlformats.org/officeDocument/2006/relationships" xmlns:m="http://schemas.openxmlformats.org/officeDocument/2006/math" xmlns:v="urn:schemas-microsoft-com:vml" xmlns:wp14="http://schemas.microsoft.com/office/word/2010/wordprocessingDrawing" xmlns:wp="http://schemas.openxmlformats.org/drawingml/2006/wordprocessingDrawing" xmlns:w10="urn:schemas-microsoft-com:office:word" xmlns:w="http://schemas.openxmlformats.org/wordprocessingml/2006/main" xmlns:w14="http://schemas.microsoft.com/office/word/2010/wordml" xmlns:w15="http://schemas.microsoft.com/office/word/2012/wordml" xmlns:w16cex="http://schemas.microsoft.com/office/word/2018/wordml/cex" xmlns:w16cid="http://schemas.microsoft.com/office/word/2016/wordml/cid" xmlns:w16="http://schemas.microsoft.com/office/word/2018/wordml" xmlns:w16sdtdh="http://schemas.microsoft.com/office/word/2020/wordml/sdtdatahash" xmlns:w16se="http://schemas.microsoft.com/office/word/2015/wordml/symex" xmlns:wpg="http://schemas.microsoft.com/office/word/2010/wordprocessingGroup" xmlns:wpi="http://schemas.microsoft.com/office/word/2010/wordprocessingInk" xmlns:wne="http://schemas.microsoft.com/office/word/2006/wordml" xmlns:wps="http://schemas.microsoft.com/office/word/2010/wordprocessingShape" mc:Ignorable="w14 w15 w16se w16cid w16 w16cex w16sdtdh wp14">
   <w:p>
     <w:pPr>
       <w:spacing w:after="160" w:line="259" w:lineRule="auto"/>
@@ -1242,7 +1250,7 @@
             </wp:anchor>
           </w:drawing>
         </mc:Choice>
-        <mc:Fallback>
+        <mc:Fallback xmlns:oel="http://schemas.microsoft.com/office/2019/extlst" xmlns:w16du="http://schemas.microsoft.com/office/word/2023/wordml/word16du" xmlns:w16sdtfl="http://schemas.microsoft.com/office/word/2024/wordml/sdtformatlock">
           <w:pict>
             <v:shapetype w14:anchorId="2C047607" id="_x0000_t202" coordsize="21600,21600" o:spt="202" path="m,l,21600r21600,l21600,xe">
               <v:stroke joinstyle="miter"/>
@@ -1285,7 +1293,7 @@
 </file>
 
 <file path=word/header2.xml><?xml version="1.0" encoding="utf-8"?>
-<w:hdr xmlns:wpc="http://schemas.microsoft.com/office/word/2010/wordprocessingCanvas" xmlns:cx="http://schemas.microsoft.com/office/drawing/2014/chartex" xmlns:cx1="http://schemas.microsoft.com/office/drawing/2015/9/8/chartex" xmlns:cx2="http://schemas.microsoft.com/office/drawing/2015/10/21/chartex" xmlns:cx3="http://schemas.microsoft.com/office/drawing/2016/5/9/chartex" xmlns:cx4="http://schemas.microsoft.com/office/drawing/2016/5/10/chartex" xmlns:cx5="http://schemas.microsoft.com/office/drawing/2016/5/11/chartex" xmlns:cx6="http://schemas.microsoft.com/office/drawing/2016/5/12/chartex" xmlns:cx7="http://schemas.microsoft.com/office/drawing/2016/5/13/chartex" xmlns:cx8="http://schemas.microsoft.com/office/drawing/2016/5/14/chartex" xmlns:mc="http://schemas.openxmlformats.org/markup-compatibility/2006" xmlns:aink="http://schemas.microsoft.com/office/drawing/2016/ink" xmlns:am3d="http://schemas.microsoft.com/office/drawing/2017/model3d" xmlns:o="urn:schemas-microsoft-com:office:office" xmlns:oel="http://schemas.microsoft.com/office/2019/extlst" xmlns:r="http://schemas.openxmlformats.org/officeDocument/2006/relationships" xmlns:m="http://schemas.openxmlformats.org/officeDocument/2006/math" xmlns:v="urn:schemas-microsoft-com:vml" xmlns:wp14="http://schemas.microsoft.com/office/word/2010/wordprocessingDrawing" xmlns:wp="http://schemas.openxmlformats.org/drawingml/2006/wordprocessingDrawing" xmlns:w10="urn:schemas-microsoft-com:office:word" xmlns:w="http://schemas.openxmlformats.org/wordprocessingml/2006/main" xmlns:w14="http://schemas.microsoft.com/office/word/2010/wordml" xmlns:w15="http://schemas.microsoft.com/office/word/2012/wordml" xmlns:w16cex="http://schemas.microsoft.com/office/word/2018/wordml/cex" xmlns:w16cid="http://schemas.microsoft.com/office/word/2016/wordml/cid" xmlns:w16="http://schemas.microsoft.com/office/word/2018/wordml" xmlns:w16du="http://schemas.microsoft.com/office/word/2023/wordml/word16du" xmlns:w16sdtdh="http://schemas.microsoft.com/office/word/2020/wordml/sdtdatahash" xmlns:w16sdtfl="http://schemas.microsoft.com/office/word/2024/wordml/sdtformatlock" xmlns:w16se="http://schemas.microsoft.com/office/word/2015/wordml/symex" xmlns:wpg="http://schemas.microsoft.com/office/word/2010/wordprocessingGroup" xmlns:wpi="http://schemas.microsoft.com/office/word/2010/wordprocessingInk" xmlns:wne="http://schemas.microsoft.com/office/word/2006/wordml" xmlns:wps="http://schemas.microsoft.com/office/word/2010/wordprocessingShape" mc:Ignorable="w14 w15 w16se w16cid w16 w16cex w16sdtdh w16sdtfl w16du wp14">
+<w:hdr xmlns:wpc="http://schemas.microsoft.com/office/word/2010/wordprocessingCanvas" xmlns:cx="http://schemas.microsoft.com/office/drawing/2014/chartex" xmlns:cx1="http://schemas.microsoft.com/office/drawing/2015/9/8/chartex" xmlns:cx2="http://schemas.microsoft.com/office/drawing/2015/10/21/chartex" xmlns:cx3="http://schemas.microsoft.com/office/drawing/2016/5/9/chartex" xmlns:cx4="http://schemas.microsoft.com/office/drawing/2016/5/10/chartex" xmlns:cx5="http://schemas.microsoft.com/office/drawing/2016/5/11/chartex" xmlns:cx6="http://schemas.microsoft.com/office/drawing/2016/5/12/chartex" xmlns:cx7="http://schemas.microsoft.com/office/drawing/2016/5/13/chartex" xmlns:cx8="http://schemas.microsoft.com/office/drawing/2016/5/14/chartex" xmlns:mc="http://schemas.openxmlformats.org/markup-compatibility/2006" xmlns:aink="http://schemas.microsoft.com/office/drawing/2016/ink" xmlns:am3d="http://schemas.microsoft.com/office/drawing/2017/model3d" xmlns:o="urn:schemas-microsoft-com:office:office" xmlns:r="http://schemas.openxmlformats.org/officeDocument/2006/relationships" xmlns:m="http://schemas.openxmlformats.org/officeDocument/2006/math" xmlns:v="urn:schemas-microsoft-com:vml" xmlns:wp14="http://schemas.microsoft.com/office/word/2010/wordprocessingDrawing" xmlns:wp="http://schemas.openxmlformats.org/drawingml/2006/wordprocessingDrawing" xmlns:w10="urn:schemas-microsoft-com:office:word" xmlns:w="http://schemas.openxmlformats.org/wordprocessingml/2006/main" xmlns:w14="http://schemas.microsoft.com/office/word/2010/wordml" xmlns:w15="http://schemas.microsoft.com/office/word/2012/wordml" xmlns:w16cex="http://schemas.microsoft.com/office/word/2018/wordml/cex" xmlns:w16cid="http://schemas.microsoft.com/office/word/2016/wordml/cid" xmlns:w16="http://schemas.microsoft.com/office/word/2018/wordml" xmlns:w16sdtdh="http://schemas.microsoft.com/office/word/2020/wordml/sdtdatahash" xmlns:w16se="http://schemas.microsoft.com/office/word/2015/wordml/symex" xmlns:wpg="http://schemas.microsoft.com/office/word/2010/wordprocessingGroup" xmlns:wpi="http://schemas.microsoft.com/office/word/2010/wordprocessingInk" xmlns:wne="http://schemas.microsoft.com/office/word/2006/wordml" xmlns:wps="http://schemas.microsoft.com/office/word/2010/wordprocessingShape" mc:Ignorable="w14 w15 w16se w16cid w16 w16cex w16sdtdh wp14">
   <w:p>
     <w:pPr>
       <w:spacing w:after="160" w:line="259" w:lineRule="auto"/>
@@ -1371,7 +1379,7 @@
             </wp:anchor>
           </w:drawing>
         </mc:Choice>
-        <mc:Fallback>
+        <mc:Fallback xmlns:oel="http://schemas.microsoft.com/office/2019/extlst" xmlns:w16du="http://schemas.microsoft.com/office/word/2023/wordml/word16du" xmlns:w16sdtfl="http://schemas.microsoft.com/office/word/2024/wordml/sdtformatlock">
           <w:pict>
             <v:shapetype w14:anchorId="51B88DCF" id="_x0000_t202" coordsize="21600,21600" o:spt="202" path="m,l,21600r21600,l21600,xe">
               <v:stroke joinstyle="miter"/>
@@ -1414,7 +1422,7 @@
 </file>
 
 <file path=word/header3.xml><?xml version="1.0" encoding="utf-8"?>
-<w:hdr xmlns:wpc="http://schemas.microsoft.com/office/word/2010/wordprocessingCanvas" xmlns:cx="http://schemas.microsoft.com/office/drawing/2014/chartex" xmlns:cx1="http://schemas.microsoft.com/office/drawing/2015/9/8/chartex" xmlns:cx2="http://schemas.microsoft.com/office/drawing/2015/10/21/chartex" xmlns:cx3="http://schemas.microsoft.com/office/drawing/2016/5/9/chartex" xmlns:cx4="http://schemas.microsoft.com/office/drawing/2016/5/10/chartex" xmlns:cx5="http://schemas.microsoft.com/office/drawing/2016/5/11/chartex" xmlns:cx6="http://schemas.microsoft.com/office/drawing/2016/5/12/chartex" xmlns:cx7="http://schemas.microsoft.com/office/drawing/2016/5/13/chartex" xmlns:cx8="http://schemas.microsoft.com/office/drawing/2016/5/14/chartex" xmlns:mc="http://schemas.openxmlformats.org/markup-compatibility/2006" xmlns:aink="http://schemas.microsoft.com/office/drawing/2016/ink" xmlns:am3d="http://schemas.microsoft.com/office/drawing/2017/model3d" xmlns:o="urn:schemas-microsoft-com:office:office" xmlns:oel="http://schemas.microsoft.com/office/2019/extlst" xmlns:r="http://schemas.openxmlformats.org/officeDocument/2006/relationships" xmlns:m="http://schemas.openxmlformats.org/officeDocument/2006/math" xmlns:v="urn:schemas-microsoft-com:vml" xmlns:wp14="http://schemas.microsoft.com/office/word/2010/wordprocessingDrawing" xmlns:wp="http://schemas.openxmlformats.org/drawingml/2006/wordprocessingDrawing" xmlns:w10="urn:schemas-microsoft-com:office:word" xmlns:w="http://schemas.openxmlformats.org/wordprocessingml/2006/main" xmlns:w14="http://schemas.microsoft.com/office/word/2010/wordml" xmlns:w15="http://schemas.microsoft.com/office/word/2012/wordml" xmlns:w16cex="http://schemas.microsoft.com/office/word/2018/wordml/cex" xmlns:w16cid="http://schemas.microsoft.com/office/word/2016/wordml/cid" xmlns:w16="http://schemas.microsoft.com/office/word/2018/wordml" xmlns:w16du="http://schemas.microsoft.com/office/word/2023/wordml/word16du" xmlns:w16sdtdh="http://schemas.microsoft.com/office/word/2020/wordml/sdtdatahash" xmlns:w16sdtfl="http://schemas.microsoft.com/office/word/2024/wordml/sdtformatlock" xmlns:w16se="http://schemas.microsoft.com/office/word/2015/wordml/symex" xmlns:wpg="http://schemas.microsoft.com/office/word/2010/wordprocessingGroup" xmlns:wpi="http://schemas.microsoft.com/office/word/2010/wordprocessingInk" xmlns:wne="http://schemas.microsoft.com/office/word/2006/wordml" xmlns:wps="http://schemas.microsoft.com/office/word/2010/wordprocessingShape" mc:Ignorable="w14 w15 w16se w16cid w16 w16cex w16sdtdh w16sdtfl w16du wp14">
+<w:hdr xmlns:wpc="http://schemas.microsoft.com/office/word/2010/wordprocessingCanvas" xmlns:cx="http://schemas.microsoft.com/office/drawing/2014/chartex" xmlns:cx1="http://schemas.microsoft.com/office/drawing/2015/9/8/chartex" xmlns:cx2="http://schemas.microsoft.com/office/drawing/2015/10/21/chartex" xmlns:cx3="http://schemas.microsoft.com/office/drawing/2016/5/9/chartex" xmlns:cx4="http://schemas.microsoft.com/office/drawing/2016/5/10/chartex" xmlns:cx5="http://schemas.microsoft.com/office/drawing/2016/5/11/chartex" xmlns:cx6="http://schemas.microsoft.com/office/drawing/2016/5/12/chartex" xmlns:cx7="http://schemas.microsoft.com/office/drawing/2016/5/13/chartex" xmlns:cx8="http://schemas.microsoft.com/office/drawing/2016/5/14/chartex" xmlns:mc="http://schemas.openxmlformats.org/markup-compatibility/2006" xmlns:aink="http://schemas.microsoft.com/office/drawing/2016/ink" xmlns:am3d="http://schemas.microsoft.com/office/drawing/2017/model3d" xmlns:o="urn:schemas-microsoft-com:office:office" xmlns:r="http://schemas.openxmlformats.org/officeDocument/2006/relationships" xmlns:m="http://schemas.openxmlformats.org/officeDocument/2006/math" xmlns:v="urn:schemas-microsoft-com:vml" xmlns:wp14="http://schemas.microsoft.com/office/word/2010/wordprocessingDrawing" xmlns:wp="http://schemas.openxmlformats.org/drawingml/2006/wordprocessingDrawing" xmlns:w10="urn:schemas-microsoft-com:office:word" xmlns:w="http://schemas.openxmlformats.org/wordprocessingml/2006/main" xmlns:w14="http://schemas.microsoft.com/office/word/2010/wordml" xmlns:w15="http://schemas.microsoft.com/office/word/2012/wordml" xmlns:w16cex="http://schemas.microsoft.com/office/word/2018/wordml/cex" xmlns:w16cid="http://schemas.microsoft.com/office/word/2016/wordml/cid" xmlns:w16="http://schemas.microsoft.com/office/word/2018/wordml" xmlns:w16sdtdh="http://schemas.microsoft.com/office/word/2020/wordml/sdtdatahash" xmlns:w16se="http://schemas.microsoft.com/office/word/2015/wordml/symex" xmlns:wpg="http://schemas.microsoft.com/office/word/2010/wordprocessingGroup" xmlns:wpi="http://schemas.microsoft.com/office/word/2010/wordprocessingInk" xmlns:wne="http://schemas.microsoft.com/office/word/2006/wordml" xmlns:wps="http://schemas.microsoft.com/office/word/2010/wordprocessingShape" mc:Ignorable="w14 w15 w16se w16cid w16 w16cex w16sdtdh wp14">
   <w:p>
     <w:pPr>
       <w:spacing w:after="160" w:line="259" w:lineRule="auto"/>
@@ -1500,7 +1508,7 @@
             </wp:anchor>
           </w:drawing>
         </mc:Choice>
-        <mc:Fallback>
+        <mc:Fallback xmlns:oel="http://schemas.microsoft.com/office/2019/extlst" xmlns:w16du="http://schemas.microsoft.com/office/word/2023/wordml/word16du" xmlns:w16sdtfl="http://schemas.microsoft.com/office/word/2024/wordml/sdtformatlock">
           <w:pict>
             <v:shapetype w14:anchorId="3B1CA6AF" id="_x0000_t202" coordsize="21600,21600" o:spt="202" path="m,l,21600r21600,l21600,xe">
               <v:stroke joinstyle="miter"/>
@@ -1543,7 +1551,7 @@
 </file>
 
 <file path=word/numbering.xml><?xml version="1.0" encoding="utf-8"?>
-<w:numbering xmlns:wpc="http://schemas.microsoft.com/office/word/2010/wordprocessingCanvas" xmlns:cx="http://schemas.microsoft.com/office/drawing/2014/chartex" xmlns:cx1="http://schemas.microsoft.com/office/drawing/2015/9/8/chartex" xmlns:cx2="http://schemas.microsoft.com/office/drawing/2015/10/21/chartex" xmlns:cx3="http://schemas.microsoft.com/office/drawing/2016/5/9/chartex" xmlns:cx4="http://schemas.microsoft.com/office/drawing/2016/5/10/chartex" xmlns:cx5="http://schemas.microsoft.com/office/drawing/2016/5/11/chartex" xmlns:cx6="http://schemas.microsoft.com/office/drawing/2016/5/12/chartex" xmlns:cx7="http://schemas.microsoft.com/office/drawing/2016/5/13/chartex" xmlns:cx8="http://schemas.microsoft.com/office/drawing/2016/5/14/chartex" xmlns:mc="http://schemas.openxmlformats.org/markup-compatibility/2006" xmlns:aink="http://schemas.microsoft.com/office/drawing/2016/ink" xmlns:am3d="http://schemas.microsoft.com/office/drawing/2017/model3d" xmlns:o="urn:schemas-microsoft-com:office:office" xmlns:oel="http://schemas.microsoft.com/office/2019/extlst" xmlns:r="http://schemas.openxmlformats.org/officeDocument/2006/relationships" xmlns:m="http://schemas.openxmlformats.org/officeDocument/2006/math" xmlns:v="urn:schemas-microsoft-com:vml" xmlns:wp14="http://schemas.microsoft.com/office/word/2010/wordprocessingDrawing" xmlns:wp="http://schemas.openxmlformats.org/drawingml/2006/wordprocessingDrawing" xmlns:w10="urn:schemas-microsoft-com:office:word" xmlns:w="http://schemas.openxmlformats.org/wordprocessingml/2006/main" xmlns:w14="http://schemas.microsoft.com/office/word/2010/wordml" xmlns:w15="http://schemas.microsoft.com/office/word/2012/wordml" xmlns:w16cex="http://schemas.microsoft.com/office/word/2018/wordml/cex" xmlns:w16cid="http://schemas.microsoft.com/office/word/2016/wordml/cid" xmlns:w16="http://schemas.microsoft.com/office/word/2018/wordml" xmlns:w16du="http://schemas.microsoft.com/office/word/2023/wordml/word16du" xmlns:w16sdtdh="http://schemas.microsoft.com/office/word/2020/wordml/sdtdatahash" xmlns:w16sdtfl="http://schemas.microsoft.com/office/word/2024/wordml/sdtformatlock" xmlns:w16se="http://schemas.microsoft.com/office/word/2015/wordml/symex" xmlns:wpg="http://schemas.microsoft.com/office/word/2010/wordprocessingGroup" xmlns:wpi="http://schemas.microsoft.com/office/word/2010/wordprocessingInk" xmlns:wne="http://schemas.microsoft.com/office/word/2006/wordml" xmlns:wps="http://schemas.microsoft.com/office/word/2010/wordprocessingShape" mc:Ignorable="w14 w15 w16se w16cid w16 w16cex w16sdtdh w16sdtfl w16du wp14">
+<w:numbering xmlns:wpc="http://schemas.microsoft.com/office/word/2010/wordprocessingCanvas" xmlns:cx="http://schemas.microsoft.com/office/drawing/2014/chartex" xmlns:cx1="http://schemas.microsoft.com/office/drawing/2015/9/8/chartex" xmlns:cx2="http://schemas.microsoft.com/office/drawing/2015/10/21/chartex" xmlns:cx3="http://schemas.microsoft.com/office/drawing/2016/5/9/chartex" xmlns:cx4="http://schemas.microsoft.com/office/drawing/2016/5/10/chartex" xmlns:cx5="http://schemas.microsoft.com/office/drawing/2016/5/11/chartex" xmlns:cx6="http://schemas.microsoft.com/office/drawing/2016/5/12/chartex" xmlns:cx7="http://schemas.microsoft.com/office/drawing/2016/5/13/chartex" xmlns:cx8="http://schemas.microsoft.com/office/drawing/2016/5/14/chartex" xmlns:mc="http://schemas.openxmlformats.org/markup-compatibility/2006" xmlns:aink="http://schemas.microsoft.com/office/drawing/2016/ink" xmlns:am3d="http://schemas.microsoft.com/office/drawing/2017/model3d" xmlns:o="urn:schemas-microsoft-com:office:office" xmlns:r="http://schemas.openxmlformats.org/officeDocument/2006/relationships" xmlns:m="http://schemas.openxmlformats.org/officeDocument/2006/math" xmlns:v="urn:schemas-microsoft-com:vml" xmlns:wp14="http://schemas.microsoft.com/office/word/2010/wordprocessingDrawing" xmlns:wp="http://schemas.openxmlformats.org/drawingml/2006/wordprocessingDrawing" xmlns:w10="urn:schemas-microsoft-com:office:word" xmlns:w="http://schemas.openxmlformats.org/wordprocessingml/2006/main" xmlns:w14="http://schemas.microsoft.com/office/word/2010/wordml" xmlns:w15="http://schemas.microsoft.com/office/word/2012/wordml" xmlns:w16cex="http://schemas.microsoft.com/office/word/2018/wordml/cex" xmlns:w16cid="http://schemas.microsoft.com/office/word/2016/wordml/cid" xmlns:w16="http://schemas.microsoft.com/office/word/2018/wordml" xmlns:w16sdtdh="http://schemas.microsoft.com/office/word/2020/wordml/sdtdatahash" xmlns:w16se="http://schemas.microsoft.com/office/word/2015/wordml/symex" xmlns:wpg="http://schemas.microsoft.com/office/word/2010/wordprocessingGroup" xmlns:wpi="http://schemas.microsoft.com/office/word/2010/wordprocessingInk" xmlns:wne="http://schemas.microsoft.com/office/word/2006/wordml" xmlns:wps="http://schemas.microsoft.com/office/word/2010/wordprocessingShape" mc:Ignorable="w14 w15 w16se w16cid w16 w16cex w16sdtdh wp14">
   <w:abstractNum w:abstractNumId="0" w15:restartNumberingAfterBreak="0">
     <w:nsid w:val="1A5A1367"/>
     <w:multiLevelType w:val="hybridMultilevel"/>
@@ -2392,23 +2400,23 @@
       </w:rPr>
     </w:lvl>
   </w:abstractNum>
-  <w:num w:numId="1" w16cid:durableId="1460220291">
+  <w:num w:numId="1">
     <w:abstractNumId w:val="3"/>
   </w:num>
-  <w:num w:numId="2" w16cid:durableId="349187285">
+  <w:num w:numId="2">
     <w:abstractNumId w:val="2"/>
   </w:num>
-  <w:num w:numId="3" w16cid:durableId="1800220503">
+  <w:num w:numId="3">
     <w:abstractNumId w:val="0"/>
   </w:num>
-  <w:num w:numId="4" w16cid:durableId="1670864845">
+  <w:num w:numId="4">
     <w:abstractNumId w:val="1"/>
   </w:num>
 </w:numbering>
 </file>
 
 <file path=word/styles.xml><?xml version="1.0" encoding="utf-8"?>
-<w:styles xmlns:mc="http://schemas.openxmlformats.org/markup-compatibility/2006" xmlns:r="http://schemas.openxmlformats.org/officeDocument/2006/relationships" xmlns:w="http://schemas.openxmlformats.org/wordprocessingml/2006/main" xmlns:w14="http://schemas.microsoft.com/office/word/2010/wordml" xmlns:w15="http://schemas.microsoft.com/office/word/2012/wordml" xmlns:w16cex="http://schemas.microsoft.com/office/word/2018/wordml/cex" xmlns:w16cid="http://schemas.microsoft.com/office/word/2016/wordml/cid" xmlns:w16="http://schemas.microsoft.com/office/word/2018/wordml" xmlns:w16du="http://schemas.microsoft.com/office/word/2023/wordml/word16du" xmlns:w16sdtdh="http://schemas.microsoft.com/office/word/2020/wordml/sdtdatahash" xmlns:w16sdtfl="http://schemas.microsoft.com/office/word/2024/wordml/sdtformatlock" xmlns:w16se="http://schemas.microsoft.com/office/word/2015/wordml/symex" mc:Ignorable="w14 w15 w16se w16cid w16 w16cex w16sdtdh w16sdtfl w16du">
+<w:styles xmlns:mc="http://schemas.openxmlformats.org/markup-compatibility/2006" xmlns:r="http://schemas.openxmlformats.org/officeDocument/2006/relationships" xmlns:w="http://schemas.openxmlformats.org/wordprocessingml/2006/main" xmlns:w14="http://schemas.microsoft.com/office/word/2010/wordml" xmlns:w15="http://schemas.microsoft.com/office/word/2012/wordml" xmlns:w16cex="http://schemas.microsoft.com/office/word/2018/wordml/cex" xmlns:w16cid="http://schemas.microsoft.com/office/word/2016/wordml/cid" xmlns:w16="http://schemas.microsoft.com/office/word/2018/wordml" xmlns:w16sdtdh="http://schemas.microsoft.com/office/word/2020/wordml/sdtdatahash" xmlns:w16se="http://schemas.microsoft.com/office/word/2015/wordml/symex" mc:Ignorable="w14 w15 w16se w16cid w16 w16cex w16sdtdh">
   <w:docDefaults>
     <w:rPrDefault>
       <w:rPr>

</xml_diff>